<commit_message>
List every file changed since the first draft in the response report's appendix B
Appendix B had a hand-written summary that missed nlparse.py, features.py,
router.py, cli.py and others. export_data.py now records
`git diff --name-only 9322f6e HEAD` (the commit that added the first
draft), and the appendix groups those files by area. Files that fit no
group are listed under 기타, so none are silently dropped.

Co-Authored-By: Claude Opus 5.5 <noreply@anthropic.com>
Claude-Session: https://claude.ai/code/session_01Tgh9FaD7Z5CarJfhd185SF
</commit_message>
<xml_diff>
--- a/docs/report/비판검토_보완보고서.docx
+++ b/docs/report/비판검토_보완보고서.docx
@@ -26003,7 +26003,210 @@
           <w:sz w:val="21"/>
           <w:szCs w:val="21"/>
         </w:rPr>
-        <w:t xml:space="preserve">코드 변경(2차본): etfrec/neural.py·signals.py·zoo.py·pipeline.py(쌍별·목표 정렬 신경망, 활성 사용자 지표, 이벤트 논리·항등식·개인정보 QA), etfrec/data.py(이벤트 정규화·요약), etfrec/catalog.py·taxonomy.py·quiz.py·lessons.py(절세 계좌, 세제·규제 문구, 진단 퀴즈, 학습 요점), etfrec/privacy.py, etfrec/sources/(공식 API·파일 정규화), etfrec/service.py·api.py·ui/(활성 지표·학습 요점·개인정보 표시), tests/, README.md, scripts/.</w:t>
+        <w:t xml:space="preserve">1차본 커밋(9322f6e) 이후 바뀐 파일 42개(git diff --name-only, etfrec·scripts·tests·docs/report/build 범위).</w:t>
+      </w:r>
+    </w:p>
+    <w:p>
+      <w:pPr>
+        <w:pStyle w:val="ListParagraph"/>
+        <w:numPr>
+          <w:ilvl w:val="0"/>
+          <w:numId w:val="2"/>
+        </w:numPr>
+        <w:spacing w:after="60" w:line="300" w:lineRule="auto"/>
+        <w:jc w:val="both"/>
+      </w:pPr>
+      <w:r>
+        <w:rPr>
+          <w:rFonts w:ascii="맑은 고딕" w:cs="맑은 고딕" w:eastAsia="맑은 고딕" w:hAnsi="맑은 고딕"/>
+          <w:b/>
+          <w:bCs/>
+          <w:sz w:val="21"/>
+          <w:szCs w:val="21"/>
+        </w:rPr>
+        <w:t xml:space="preserve">모델·평가·특징: </w:t>
+      </w:r>
+      <w:r>
+        <w:rPr>
+          <w:rFonts w:ascii="맑은 고딕" w:cs="맑은 고딕" w:eastAsia="맑은 고딕" w:hAnsi="맑은 고딕"/>
+          <w:sz w:val="21"/>
+          <w:szCs w:val="21"/>
+        </w:rPr>
+        <w:t xml:space="preserve">evaluation.py, features.py, neural.py, pipeline.py, router.py, signals.py, zoo.py — 쌍별·목표 정렬 신경망과 학습 범위, 활성 사용자 지표, A/B 대조군 평가 행, 이벤트 논리·항등식·누수·개인정보 QA, 경로 크기 구간, 진단 행을 뺀 수준 갱신</w:t>
+      </w:r>
+    </w:p>
+    <w:p>
+      <w:pPr>
+        <w:pStyle w:val="ListParagraph"/>
+        <w:numPr>
+          <w:ilvl w:val="0"/>
+          <w:numId w:val="2"/>
+        </w:numPr>
+        <w:spacing w:after="60" w:line="300" w:lineRule="auto"/>
+        <w:jc w:val="both"/>
+      </w:pPr>
+      <w:r>
+        <w:rPr>
+          <w:rFonts w:ascii="맑은 고딕" w:cs="맑은 고딕" w:eastAsia="맑은 고딕" w:hAnsi="맑은 고딕"/>
+          <w:b/>
+          <w:bCs/>
+          <w:sz w:val="21"/>
+          <w:szCs w:val="21"/>
+        </w:rPr>
+        <w:t xml:space="preserve">데이터·카탈로그: </w:t>
+      </w:r>
+      <w:r>
+        <w:rPr>
+          <w:rFonts w:ascii="맑은 고딕" w:cs="맑은 고딕" w:eastAsia="맑은 고딕" w:hAnsi="맑은 고딕"/>
+          <w:sz w:val="21"/>
+          <w:szCs w:val="21"/>
+        </w:rPr>
+        <w:t xml:space="preserve">__init__.py, catalog.py, config.py, data.py — 이벤트 정규화, 스키마 밖 열 제거, 형 정규화, 출처 라벨, 절세 계좌 주제, 선수 관계 검사</w:t>
+      </w:r>
+    </w:p>
+    <w:p>
+      <w:pPr>
+        <w:pStyle w:val="ListParagraph"/>
+        <w:numPr>
+          <w:ilvl w:val="0"/>
+          <w:numId w:val="2"/>
+        </w:numPr>
+        <w:spacing w:after="60" w:line="300" w:lineRule="auto"/>
+        <w:jc w:val="both"/>
+      </w:pPr>
+      <w:r>
+        <w:rPr>
+          <w:rFonts w:ascii="맑은 고딕" w:cs="맑은 고딕" w:eastAsia="맑은 고딕" w:hAnsi="맑은 고딕"/>
+          <w:b/>
+          <w:bCs/>
+          <w:sz w:val="21"/>
+          <w:szCs w:val="21"/>
+        </w:rPr>
+        <w:t xml:space="preserve">교육 설계: </w:t>
+      </w:r>
+      <w:r>
+        <w:rPr>
+          <w:rFonts w:ascii="맑은 고딕" w:cs="맑은 고딕" w:eastAsia="맑은 고딕" w:hAnsi="맑은 고딕"/>
+          <w:sz w:val="21"/>
+          <w:szCs w:val="21"/>
+        </w:rPr>
+        <w:t xml:space="preserve">lessons.py, quiz.py, roadmap.py, taxonomy.py — 공통 기초, 유형 목적, 세제·규제 문구, 진단 채점 규칙, 학습 요점</w:t>
+      </w:r>
+    </w:p>
+    <w:p>
+      <w:pPr>
+        <w:pStyle w:val="ListParagraph"/>
+        <w:numPr>
+          <w:ilvl w:val="0"/>
+          <w:numId w:val="2"/>
+        </w:numPr>
+        <w:spacing w:after="60" w:line="300" w:lineRule="auto"/>
+        <w:jc w:val="both"/>
+      </w:pPr>
+      <w:r>
+        <w:rPr>
+          <w:rFonts w:ascii="맑은 고딕" w:cs="맑은 고딕" w:eastAsia="맑은 고딕" w:hAnsi="맑은 고딕"/>
+          <w:b/>
+          <w:bCs/>
+          <w:sz w:val="21"/>
+          <w:szCs w:val="21"/>
+        </w:rPr>
+        <w:t xml:space="preserve">개인정보: </w:t>
+      </w:r>
+      <w:r>
+        <w:rPr>
+          <w:rFonts w:ascii="맑은 고딕" w:cs="맑은 고딕" w:eastAsia="맑은 고딕" w:hAnsi="맑은 고딕"/>
+          <w:sz w:val="21"/>
+          <w:szCs w:val="21"/>
+        </w:rPr>
+        <w:t xml:space="preserve">privacy.py — 저장 최소화, 감사, k-익명 반출, 저장 설계 가림</w:t>
+      </w:r>
+    </w:p>
+    <w:p>
+      <w:pPr>
+        <w:pStyle w:val="ListParagraph"/>
+        <w:numPr>
+          <w:ilvl w:val="0"/>
+          <w:numId w:val="2"/>
+        </w:numPr>
+        <w:spacing w:after="60" w:line="300" w:lineRule="auto"/>
+        <w:jc w:val="both"/>
+      </w:pPr>
+      <w:r>
+        <w:rPr>
+          <w:rFonts w:ascii="맑은 고딕" w:cs="맑은 고딕" w:eastAsia="맑은 고딕" w:hAnsi="맑은 고딕"/>
+          <w:b/>
+          <w:bCs/>
+          <w:sz w:val="21"/>
+          <w:szCs w:val="21"/>
+        </w:rPr>
+        <w:t xml:space="preserve">공개 데이터: </w:t>
+      </w:r>
+      <w:r>
+        <w:rPr>
+          <w:rFonts w:ascii="맑은 고딕" w:cs="맑은 고딕" w:eastAsia="맑은 고딕" w:hAnsi="맑은 고딕"/>
+          <w:sz w:val="21"/>
+          <w:szCs w:val="21"/>
+        </w:rPr>
+        <w:t xml:space="preserve">sources/__init__.py, sources/data/etf_list_sample.csv, sources/datagokr.py, sources/krx.py, sources/net.py, sources/registry.py, sources/sync.py — 공식 API·파일 정규화, 원자적 스냅샷, 키 처리, 샘플 종목 CSV</w:t>
+      </w:r>
+    </w:p>
+    <w:p>
+      <w:pPr>
+        <w:pStyle w:val="ListParagraph"/>
+        <w:numPr>
+          <w:ilvl w:val="0"/>
+          <w:numId w:val="2"/>
+        </w:numPr>
+        <w:spacing w:after="60" w:line="300" w:lineRule="auto"/>
+        <w:jc w:val="both"/>
+      </w:pPr>
+      <w:r>
+        <w:rPr>
+          <w:rFonts w:ascii="맑은 고딕" w:cs="맑은 고딕" w:eastAsia="맑은 고딕" w:hAnsi="맑은 고딕"/>
+          <w:b/>
+          <w:bCs/>
+          <w:sz w:val="21"/>
+          <w:szCs w:val="21"/>
+        </w:rPr>
+        <w:t xml:space="preserve">서빙·화면: </w:t>
+      </w:r>
+      <w:r>
+        <w:rPr>
+          <w:rFonts w:ascii="맑은 고딕" w:cs="맑은 고딕" w:eastAsia="맑은 고딕" w:hAnsi="맑은 고딕"/>
+          <w:sz w:val="21"/>
+          <w:szCs w:val="21"/>
+        </w:rPr>
+        <w:t xml:space="preserve">api.py, cli.py, nlparse.py, service.py, ui/app.js, ui/index.html, ui/style.css — 학습자 조회 스위치, 기법 제한, 입력 검사, 오류 표시, 파서 규칙</w:t>
+      </w:r>
+    </w:p>
+    <w:p>
+      <w:pPr>
+        <w:pStyle w:val="ListParagraph"/>
+        <w:numPr>
+          <w:ilvl w:val="0"/>
+          <w:numId w:val="2"/>
+        </w:numPr>
+        <w:spacing w:after="60" w:line="300" w:lineRule="auto"/>
+        <w:jc w:val="both"/>
+      </w:pPr>
+      <w:r>
+        <w:rPr>
+          <w:rFonts w:ascii="맑은 고딕" w:cs="맑은 고딕" w:eastAsia="맑은 고딕" w:hAnsi="맑은 고딕"/>
+          <w:b/>
+          <w:bCs/>
+          <w:sz w:val="21"/>
+          <w:szCs w:val="21"/>
+        </w:rPr>
+        <w:t xml:space="preserve">테스트·스크립트·보고서 빌드: </w:t>
+      </w:r>
+      <w:r>
+        <w:rPr>
+          <w:rFonts w:ascii="맑은 고딕" w:cs="맑은 고딕" w:eastAsia="맑은 고딕" w:hAnsi="맑은 고딕"/>
+          <w:sz w:val="21"/>
+          <w:szCs w:val="21"/>
+        </w:rPr>
+        <w:t xml:space="preserve">docs/report/build/build.sh, docs/report/build/build_critique_response.js, docs/report/build/build_report.js, docs/report/build/export_data.py, docs/report/build/make_figures.py, scripts/results_table.py, scripts/ui_walkthrough.mjs, tests/test_nlparse.py, tests/test_pipeline_service.py, tests/test_privacy.py, tests/test_roadmap_sources.py, tests/test_sources.py — 회귀·개인정보·수집·파서 테스트, 결과 표·화면 점검 스크립트, 보고서 생성</w:t>
       </w:r>
     </w:p>
     <w:sectPr>

</xml_diff>